<commit_message>
Add SharePoint Excel response template
</commit_message>
<xml_diff>
--- a/deliverables/Prime_Control_NPS_Documentacao_Executiva_Tecnica_v1_4.docx
+++ b/deliverables/Prime_Control_NPS_Documentacao_Executiva_Tecnica_v1_4.docx
@@ -389,7 +389,7 @@
           <w:color w:val="5C6F82"/>
           <w:sz w:val="20"/>
         </w:rPr>
-        <w:t>Versão: 1.4 | Atualizado em: 22/05/2026</w:t>
+        <w:t>Versão: 1.4 | Atualizado em: 23/05/2026</w:t>
       </w:r>
     </w:p>
     <w:p>
@@ -6112,7 +6112,7 @@
           <w:color w:val="102A43"/>
           <w:sz w:val="21"/>
         </w:rPr>
-        <w:t>As exportações CSV, Excel e PDF devem conter respostas, indicadores e sinais comportamentais, não apenas nota final.</w:t>
+        <w:t>As exportações CSV, Excel e PDF devem conter respostas, indicadores e sinais comportamentais, não apenas nota final. Para a planilha oficial em OneDrive/SharePoint, a recomendação é manter o Supabase como base principal e atualizar uma aba chamada Base automática via Microsoft Graph API.</w:t>
       </w:r>
     </w:p>
     <w:p>
@@ -6188,6 +6188,21 @@
           <w:sz w:val="20"/>
         </w:rPr>
         <w:t>Qualidade: campos abertos preenchidos, tamanho de comentário e resposta parcial.</w:t>
+      </w:r>
+    </w:p>
+    <w:p>
+      <w:pPr>
+        <w:pStyle w:val="ListBullet"/>
+        <w:spacing w:after="60" w:line="269" w:lineRule="auto"/>
+        <w:ind w:left="360"/>
+      </w:pPr>
+      <w:r>
+        <w:rPr>
+          <w:rFonts w:ascii="Arial" w:hAnsi="Arial"/>
+          <w:color w:val="102A43"/>
+          <w:sz w:val="20"/>
+        </w:rPr>
+        <w:t>Excel corporativo: arquivo Respostas NPS 2026 no SharePoint/OneDrive, com aba Base automática para integração e abas separadas para resumo executivo, dicionário e configurações.</w:t>
       </w:r>
     </w:p>
     <w:p>
@@ -8162,7 +8177,7 @@
                 <w:color w:val="102A43"/>
                 <w:sz w:val="18"/>
               </w:rPr>
-              <w:t>Funil, abandono, clientes silenciosos e exportação CSV/Excel/PDF.</w:t>
+              <w:t>Funil, abandono, clientes silenciosos, exportação CSV/Excel/PDF e modelo oficial de planilha SharePoint.</w:t>
             </w:r>
           </w:p>
         </w:tc>
@@ -8425,7 +8440,7 @@
           <w:color w:val="102A43"/>
           <w:sz w:val="20"/>
         </w:rPr>
-        <w:t>Gerar exportações CSV, Excel visual e PDF executivo.</w:t>
+        <w:t>Gerar exportações CSV, Excel visual, PDF executivo e modelo oficial para OneDrive/SharePoint.</w:t>
       </w:r>
     </w:p>
     <w:p>
@@ -9039,7 +9054,7 @@
                 <w:color w:val="102A43"/>
                 <w:sz w:val="18"/>
               </w:rPr>
-              <w:t>Importação oficial de respondentes, integração HubSpot, PostHog, GA4, subdomínio nps.primecontrol.com.br, refinamento final do dashboard e validação de campanha.</w:t>
+              <w:t>Importação oficial de respondentes, integração HubSpot, integração Microsoft Graph com SharePoint/OneDrive, PostHog, GA4, subdomínio nps.primecontrol.com.br, refinamento final do dashboard e validação de campanha.</w:t>
             </w:r>
           </w:p>
         </w:tc>
@@ -9503,7 +9518,7 @@
                 <w:color w:val="102A43"/>
                 <w:sz w:val="18"/>
               </w:rPr>
-              <w:t>CSV bruto, Excel visual em tons de cinza e PDF executivo resumido.</w:t>
+              <w:t>CSV bruto, Excel visual em tons de cinza, PDF executivo resumido e modelo oficial de planilha SharePoint/OneDrive.</w:t>
             </w:r>
           </w:p>
         </w:tc>

</xml_diff>